<commit_message>
Deployed c38b683 with MkDocs version: 1.6.1
</commit_message>
<xml_diff>
--- a/tema5/plantillas/Actividad_5_2_INU_Plantilla.docx
+++ b/tema5/plantillas/Actividad_5_2_INU_Plantilla.docx
@@ -139,7 +139,7 @@
                 <w:sz w:val="20"/>
                 <w:szCs w:val="20"/>
               </w:rPr>
-              <w:t xml:space="preserve">Nombre y apellidos: _______________________________________________________</w:t>
+              <w:t xml:space="preserve">Nombre y apellidos: _____________________________________________________</w:t>
             </w:r>
           </w:p>
           <w:p>
@@ -167,7 +167,7 @@
                 <w:sz w:val="20"/>
                 <w:szCs w:val="20"/>
               </w:rPr>
-              <w:t xml:space="preserve">Identificador de recursos usado (ej. inventario-&lt;tu-identificador&gt;): _______________________</w:t>
+              <w:t xml:space="preserve">Identificador de recursos usado (ej. escaparate-asg-&lt;tu-identificador&gt;): _______________________</w:t>
             </w:r>
           </w:p>
         </w:tc>
@@ -198,7 +198,7 @@
           <w:sz w:val="26"/>
           <w:szCs w:val="26"/>
         </w:rPr>
-        <w:t xml:space="preserve">Parte A — Rol en vez de credenciales</w:t>
+        <w:t xml:space="preserve">Parte A — Migración a S3 y lectura de permisos reales</w:t>
       </w:r>
     </w:p>
     <w:p>
@@ -222,7 +222,7 @@
           <w:sz w:val="24"/>
           <w:szCs w:val="24"/>
         </w:rPr>
-        <w:t xml:space="preserve">Paso 1 — Lanza la instancia de Inventario</w:t>
+        <w:t xml:space="preserve">Paso 1 — Crea el bucket privado de imágenes</w:t>
       </w:r>
     </w:p>
     <w:tbl>
@@ -268,7 +268,7 @@
                 <w:sz w:val="20"/>
                 <w:szCs w:val="20"/>
               </w:rPr>
-              <w:t xml:space="preserve">📸 Instancia respondiendo en el puerto 80, con el error de acceso al bucket antes de tener rol asignado</w:t>
+              <w:t xml:space="preserve">📸 El bucket creado, con la columna de acceso público mostrando que está bloqueado</w:t>
             </w:r>
           </w:p>
         </w:tc>
@@ -315,7 +315,7 @@
     </w:tbl>
     <w:p>
       <w:pPr>
-        <w:spacing w:after="160"/>
+        <w:spacing w:after="200"/>
       </w:pPr>
     </w:p>
     <w:p>
@@ -334,7 +334,7 @@
           <w:sz w:val="24"/>
           <w:szCs w:val="24"/>
         </w:rPr>
-        <w:t xml:space="preserve">Paso 2 — Adjunta el rol preasignado a la instancia</w:t>
+        <w:t xml:space="preserve">Paso 2 — Cambia el almacenamiento de Escaparate a S3</w:t>
       </w:r>
     </w:p>
     <w:tbl>
@@ -380,7 +380,7 @@
                 <w:sz w:val="20"/>
                 <w:szCs w:val="20"/>
               </w:rPr>
-              <w:t xml:space="preserve">📸 Rol de IAM del Learner Lab adjuntado a la instancia, y el listado del bucket ya visible como fichas de inventario</w:t>
+              <w:t xml:space="preserve">📸 La plantilla de lanzamiento mostrando la versión nueva como predeterminada, y el grupo de destino con las dos instancias healthy</w:t>
             </w:r>
           </w:p>
         </w:tc>
@@ -429,6 +429,11 @@
       <w:pPr>
         <w:spacing w:after="200"/>
       </w:pPr>
+    </w:p>
+    <w:p>
+      <w:r>
+        <w:br w:type="page"/>
+      </w:r>
     </w:p>
     <w:p>
       <w:pPr>
@@ -446,7 +451,7 @@
           <w:sz w:val="24"/>
           <w:szCs w:val="24"/>
         </w:rPr>
-        <w:t xml:space="preserve">Paso 3 — Verifica el acceso sin credenciales propias</w:t>
+        <w:t xml:space="preserve">Paso 3 — Verifica que el acceso a S3 funciona sin credenciales estáticas</w:t>
       </w:r>
     </w:p>
     <w:tbl>
@@ -492,7 +497,7 @@
                 <w:sz w:val="20"/>
                 <w:szCs w:val="20"/>
               </w:rPr>
-              <w:t xml:space="preserve">📸 Salida de aws s3 ls, y comprobación de que no existe ~/.aws/credentials con claves escritas</w:t>
+              <w:t xml:space="preserve">📸 El producto nuevo respondiendo con su imagen, y el objeto correspondiente visible dentro del bucket</w:t>
             </w:r>
           </w:p>
         </w:tc>
@@ -539,7 +544,7 @@
     </w:tbl>
     <w:p>
       <w:pPr>
-        <w:spacing w:after="160"/>
+        <w:spacing w:after="200"/>
       </w:pPr>
     </w:p>
     <w:p>
@@ -558,7 +563,147 @@
           <w:sz w:val="24"/>
           <w:szCs w:val="24"/>
         </w:rPr>
-        <w:t xml:space="preserve">Reflexiona</w:t>
+        <w:t xml:space="preserve">Paso 4 — Investiga el alcance real de tu rol con el simulador de políticas</w:t>
+      </w:r>
+    </w:p>
+    <w:tbl>
+      <w:tblPr>
+        <w:tblW w:type="dxa" w:w="9638"/>
+        <w:tblBorders>
+          <w:top w:val="single" w:color="auto" w:sz="4"/>
+          <w:left w:val="single" w:color="auto" w:sz="4"/>
+          <w:bottom w:val="single" w:color="auto" w:sz="4"/>
+          <w:right w:val="single" w:color="auto" w:sz="4"/>
+          <w:insideH w:val="single" w:color="auto" w:sz="4"/>
+          <w:insideV w:val="single" w:color="auto" w:sz="4"/>
+        </w:tblBorders>
+      </w:tblPr>
+      <w:tblGrid>
+        <w:gridCol w:w="9638"/>
+      </w:tblGrid>
+      <w:tr>
+        <w:tc>
+          <w:tcPr>
+            <w:tcW w:type="dxa" w:w="9638"/>
+            <w:tcBorders>
+              <w:top w:val="none" w:color="FFFFFF" w:sz="0"/>
+              <w:left w:val="none" w:color="FFFFFF" w:sz="0"/>
+              <w:bottom w:val="none" w:color="FFFFFF" w:sz="0"/>
+              <w:right w:val="none" w:color="FFFFFF" w:sz="0"/>
+            </w:tcBorders>
+            <w:shd w:fill="3949AB" w:val="clear"/>
+            <w:tcMar>
+              <w:top w:type="dxa" w:w="80"/>
+              <w:left w:type="dxa" w:w="160"/>
+              <w:bottom w:type="dxa" w:w="80"/>
+              <w:right w:type="dxa" w:w="160"/>
+            </w:tcMar>
+          </w:tcPr>
+          <w:p>
+            <w:r>
+              <w:rPr>
+                <w:rFonts w:ascii="Arial" w:cs="Arial" w:eastAsia="Arial" w:hAnsi="Arial"/>
+                <w:b/>
+                <w:bCs/>
+                <w:color w:val="FFFFFF"/>
+                <w:sz w:val="20"/>
+                <w:szCs w:val="20"/>
+              </w:rPr>
+              <w:t xml:space="preserve">📸 La salida completa del comando simulate-principal-policy</w:t>
+            </w:r>
+          </w:p>
+        </w:tc>
+      </w:tr>
+      <w:tr>
+        <w:trPr>
+          <w:trHeight w:val="2400"/>
+        </w:trPr>
+        <w:tc>
+          <w:tcPr>
+            <w:tcW w:type="dxa" w:w="9638"/>
+            <w:tcBorders>
+              <w:top w:val="single" w:color="E0E0E0" w:sz="4"/>
+              <w:left w:val="single" w:color="E0E0E0" w:sz="4"/>
+              <w:bottom w:val="single" w:color="E0E0E0" w:sz="4"/>
+              <w:right w:val="single" w:color="E0E0E0" w:sz="4"/>
+            </w:tcBorders>
+            <w:shd w:fill="FAFAFA" w:val="clear"/>
+            <w:tcMar>
+              <w:top w:type="dxa" w:w="80"/>
+              <w:left w:type="dxa" w:w="160"/>
+              <w:bottom w:type="dxa" w:w="80"/>
+              <w:right w:type="dxa" w:w="160"/>
+            </w:tcMar>
+          </w:tcPr>
+          <w:p>
+            <w:pPr>
+              <w:jc w:val="center"/>
+            </w:pPr>
+            <w:r>
+              <w:rPr>
+                <w:rFonts w:ascii="Arial" w:cs="Arial" w:eastAsia="Arial" w:hAnsi="Arial"/>
+                <w:i/>
+                <w:iCs/>
+                <w:color w:val="757575"/>
+                <w:sz w:val="20"/>
+                <w:szCs w:val="20"/>
+              </w:rPr>
+              <w:t xml:space="preserve">[Pega aquí la captura de pantalla]</w:t>
+            </w:r>
+          </w:p>
+        </w:tc>
+      </w:tr>
+    </w:tbl>
+    <w:p>
+      <w:pPr>
+        <w:spacing w:after="200"/>
+      </w:pPr>
+    </w:p>
+    <w:p>
+      <w:r>
+        <w:br w:type="page"/>
+      </w:r>
+    </w:p>
+    <w:p>
+      <w:pPr>
+        <w:shd w:fill="3949AB" w:val="clear"/>
+        <w:spacing w:after="0" w:before="320"/>
+        <w:ind w:left="200" w:right="200"/>
+      </w:pPr>
+      <w:r>
+        <w:rPr>
+          <w:rFonts w:ascii="Arial" w:cs="Arial" w:eastAsia="Arial" w:hAnsi="Arial"/>
+          <w:b/>
+          <w:bCs/>
+          <w:color w:val="FFFFFF"/>
+          <w:sz w:val="26"/>
+          <w:szCs w:val="26"/>
+        </w:rPr>
+        <w:t xml:space="preserve">Parte B — Reto: corrige y diseña permisos sin tocar la consola de IAM</w:t>
+      </w:r>
+    </w:p>
+    <w:p>
+      <w:pPr>
+        <w:spacing w:after="120"/>
+      </w:pPr>
+    </w:p>
+    <w:p>
+      <w:pPr>
+        <w:pBdr>
+          <w:bottom w:val="single" w:color="FFA000" w:sz="4" w:space="1"/>
+        </w:pBdr>
+        <w:spacing w:after="120" w:before="240"/>
+      </w:pPr>
+      <w:r>
+        <w:rPr>
+          <w:rFonts w:ascii="Arial" w:cs="Arial" w:eastAsia="Arial" w:hAnsi="Arial"/>
+          <w:b/>
+          <w:bCs/>
+          <w:color w:val="3949AB"/>
+          <w:sz w:val="24"/>
+          <w:szCs w:val="24"/>
+        </w:rPr>
+        <w:t xml:space="preserve">Corrige esta política mal escrita</w:t>
       </w:r>
     </w:p>
     <w:p>
@@ -572,7 +717,7 @@
           <w:sz w:val="22"/>
           <w:szCs w:val="22"/>
         </w:rPr>
-        <w:t xml:space="preserve">Si mañana el rol preasignado del Learner Lab cambiase de permisos, ¿qué tendrías que modificar en tu instancia para que Inventario siguiera accediendo a S3? Compáralo con lo que habrías tenido que hacer si hubieras usado credenciales fijas guardadas dentro de la instancia.</w:t>
+        <w:t xml:space="preserve">Explica todo lo que hay de malo en la política del enunciado (piensa en el principio de mínimo privilegio, en el alcance de Action y en el de Resource):</w:t>
       </w:r>
     </w:p>
     <w:tbl>
@@ -686,122 +831,11 @@
           </w:p>
         </w:tc>
       </w:tr>
-      <w:tr>
-        <w:trPr>
-          <w:trHeight w:val="480"/>
-        </w:trPr>
-        <w:tc>
-          <w:tcPr>
-            <w:tcW w:type="dxa" w:w="9638"/>
-            <w:tcBorders>
-              <w:top w:val="single" w:color="E0E0E0" w:sz="4"/>
-              <w:left w:val="single" w:color="E0E0E0" w:sz="4"/>
-              <w:bottom w:val="single" w:color="E0E0E0" w:sz="4"/>
-              <w:right w:val="single" w:color="E0E0E0" w:sz="4"/>
-            </w:tcBorders>
-            <w:shd w:fill="FAFAFA" w:val="clear"/>
-            <w:tcMar>
-              <w:top w:type="dxa" w:w="60"/>
-              <w:left w:type="dxa" w:w="160"/>
-              <w:bottom w:type="dxa" w:w="60"/>
-              <w:right w:type="dxa" w:w="160"/>
-            </w:tcMar>
-          </w:tcPr>
-          <w:p>
-            <w:r>
-              <w:rPr>
-                <w:sz w:val="22"/>
-                <w:szCs w:val="22"/>
-              </w:rPr>
-              <w:t xml:space="preserve"/>
-            </w:r>
-          </w:p>
-        </w:tc>
-      </w:tr>
-      <w:tr>
-        <w:trPr>
-          <w:trHeight w:val="480"/>
-        </w:trPr>
-        <w:tc>
-          <w:tcPr>
-            <w:tcW w:type="dxa" w:w="9638"/>
-            <w:tcBorders>
-              <w:top w:val="single" w:color="E0E0E0" w:sz="4"/>
-              <w:left w:val="single" w:color="E0E0E0" w:sz="4"/>
-              <w:bottom w:val="single" w:color="E0E0E0" w:sz="4"/>
-              <w:right w:val="single" w:color="E0E0E0" w:sz="4"/>
-            </w:tcBorders>
-            <w:shd w:fill="FAFAFA" w:val="clear"/>
-            <w:tcMar>
-              <w:top w:type="dxa" w:w="60"/>
-              <w:left w:type="dxa" w:w="160"/>
-              <w:bottom w:type="dxa" w:w="60"/>
-              <w:right w:type="dxa" w:w="160"/>
-            </w:tcMar>
-          </w:tcPr>
-          <w:p>
-            <w:r>
-              <w:rPr>
-                <w:sz w:val="22"/>
-                <w:szCs w:val="22"/>
-              </w:rPr>
-              <w:t xml:space="preserve"/>
-            </w:r>
-          </w:p>
-        </w:tc>
-      </w:tr>
     </w:tbl>
     <w:p>
       <w:pPr>
-        <w:spacing w:after="200"/>
-      </w:pPr>
-    </w:p>
-    <w:p>
-      <w:r>
-        <w:br w:type="page"/>
-      </w:r>
-    </w:p>
-    <w:p>
-      <w:pPr>
-        <w:shd w:fill="3949AB" w:val="clear"/>
-        <w:spacing w:after="0" w:before="320"/>
-        <w:ind w:left="200" w:right="200"/>
-      </w:pPr>
-      <w:r>
-        <w:rPr>
-          <w:rFonts w:ascii="Arial" w:cs="Arial" w:eastAsia="Arial" w:hAnsi="Arial"/>
-          <w:b/>
-          <w:bCs/>
-          <w:color w:val="FFFFFF"/>
-          <w:sz w:val="26"/>
-          <w:szCs w:val="26"/>
-        </w:rPr>
-        <w:t xml:space="preserve">Parte B — Reto: políticas mal escritas y auditoría real</w:t>
-      </w:r>
-    </w:p>
-    <w:p>
-      <w:pPr>
         <w:spacing w:after="120"/>
       </w:pPr>
-    </w:p>
-    <w:p>
-      <w:pPr>
-        <w:pBdr>
-          <w:bottom w:val="single" w:color="FFA000" w:sz="4" w:space="1"/>
-        </w:pBdr>
-        <w:spacing w:after="120" w:before="240"/>
-      </w:pPr>
-      <w:r>
-        <w:rPr>
-          <w:rFonts w:ascii="Arial" w:cs="Arial" w:eastAsia="Arial" w:hAnsi="Arial"/>
-          <w:b/>
-          <w:bCs/>
-          <w:color w:val="3949AB"/>
-          <w:sz w:val="24"/>
-          <w:szCs w:val="24"/>
-        </w:rPr>
-        <w:t xml:space="preserve">Corrige cinco políticas sin ayuda paso a paso</w:t>
-      </w:r>
     </w:p>
     <w:p>
       <w:pPr>
@@ -814,7 +848,7 @@
           <w:sz w:val="22"/>
           <w:szCs w:val="22"/>
         </w:rPr>
-        <w:t xml:space="preserve">Para cada una de las cinco políticas: predicción escrita, antes de tocar nada, de qué acceso de más está concediendo.</w:t>
+        <w:t xml:space="preserve">Reescríbela para que conceda exactamente lo que Escaparate necesita sobre su propio bucket de imágenes — ni una acción ni un recurso de más:</w:t>
       </w:r>
     </w:p>
     <w:tbl>
@@ -992,43 +1026,49 @@
           </w:p>
         </w:tc>
       </w:tr>
-      <w:tr>
-        <w:trPr>
-          <w:trHeight w:val="480"/>
-        </w:trPr>
-        <w:tc>
-          <w:tcPr>
-            <w:tcW w:type="dxa" w:w="9638"/>
-            <w:tcBorders>
-              <w:top w:val="single" w:color="E0E0E0" w:sz="4"/>
-              <w:left w:val="single" w:color="E0E0E0" w:sz="4"/>
-              <w:bottom w:val="single" w:color="E0E0E0" w:sz="4"/>
-              <w:right w:val="single" w:color="E0E0E0" w:sz="4"/>
-            </w:tcBorders>
-            <w:shd w:fill="FAFAFA" w:val="clear"/>
-            <w:tcMar>
-              <w:top w:type="dxa" w:w="60"/>
-              <w:left w:type="dxa" w:w="160"/>
-              <w:bottom w:type="dxa" w:w="60"/>
-              <w:right w:type="dxa" w:w="160"/>
-            </w:tcMar>
-          </w:tcPr>
-          <w:p>
-            <w:r>
-              <w:rPr>
-                <w:sz w:val="22"/>
-                <w:szCs w:val="22"/>
-              </w:rPr>
-              <w:t xml:space="preserve"/>
-            </w:r>
-          </w:p>
-        </w:tc>
-      </w:tr>
     </w:tbl>
     <w:p>
       <w:pPr>
         <w:spacing w:after="160"/>
       </w:pPr>
+    </w:p>
+    <w:p>
+      <w:r>
+        <w:br w:type="page"/>
+      </w:r>
+    </w:p>
+    <w:p>
+      <w:pPr>
+        <w:pBdr>
+          <w:bottom w:val="single" w:color="FFA000" w:sz="4" w:space="1"/>
+        </w:pBdr>
+        <w:spacing w:after="120" w:before="240"/>
+      </w:pPr>
+      <w:r>
+        <w:rPr>
+          <w:rFonts w:ascii="Arial" w:cs="Arial" w:eastAsia="Arial" w:hAnsi="Arial"/>
+          <w:b/>
+          <w:bCs/>
+          <w:color w:val="3949AB"/>
+          <w:sz w:val="24"/>
+          <w:szCs w:val="24"/>
+        </w:rPr>
+        <w:t xml:space="preserve">Diseña en papel la estructura de permisos de una organización con al menos tres roles distintos</w:t>
+      </w:r>
+    </w:p>
+    <w:p>
+      <w:pPr>
+        <w:spacing w:after="100"/>
+      </w:pPr>
+      <w:r>
+        <w:rPr>
+          <w:rFonts w:ascii="Arial" w:cs="Arial" w:eastAsia="Arial" w:hAnsi="Arial"/>
+          <w:color w:val="212121"/>
+          <w:sz w:val="22"/>
+          <w:szCs w:val="22"/>
+        </w:rPr>
+        <w:t xml:space="preserve">Para cada rol: qué necesita poder hacer de verdad (acciones y servicios concretos), qué no debería poder hacer aunque le fuera útil alguna vez, y por qué esa separación reduce el daño posible si esa identidad se ve comprometida.</w:t>
+      </w:r>
     </w:p>
     <w:tbl>
       <w:tblPr>
@@ -1043,27 +1083,33 @@
         </w:tblBorders>
       </w:tblPr>
       <w:tblGrid>
-        <w:gridCol w:w="9638"/>
+        <w:gridCol w:w="1446"/>
+        <w:gridCol w:w="2699"/>
+        <w:gridCol w:w="2699"/>
+        <w:gridCol w:w="2795"/>
       </w:tblGrid>
       <w:tr>
         <w:tc>
           <w:tcPr>
-            <w:tcW w:type="dxa" w:w="9638"/>
-            <w:tcBorders>
-              <w:top w:val="none" w:color="FFFFFF" w:sz="0"/>
-              <w:left w:val="none" w:color="FFFFFF" w:sz="0"/>
-              <w:bottom w:val="none" w:color="FFFFFF" w:sz="0"/>
-              <w:right w:val="none" w:color="FFFFFF" w:sz="0"/>
+            <w:tcW w:type="dxa" w:w="1446"/>
+            <w:tcBorders>
+              <w:top w:val="single" w:color="E0E0E0" w:sz="4"/>
+              <w:left w:val="single" w:color="E0E0E0" w:sz="4"/>
+              <w:bottom w:val="single" w:color="E0E0E0" w:sz="4"/>
+              <w:right w:val="single" w:color="E0E0E0" w:sz="4"/>
             </w:tcBorders>
             <w:shd w:fill="3949AB" w:val="clear"/>
             <w:tcMar>
-              <w:top w:type="dxa" w:w="80"/>
-              <w:left w:type="dxa" w:w="160"/>
-              <w:bottom w:type="dxa" w:w="80"/>
-              <w:right w:type="dxa" w:w="160"/>
-            </w:tcMar>
-          </w:tcPr>
-          <w:p>
+              <w:top w:type="dxa" w:w="100"/>
+              <w:left w:type="dxa" w:w="140"/>
+              <w:bottom w:type="dxa" w:w="100"/>
+              <w:right w:type="dxa" w:w="100"/>
+            </w:tcMar>
+          </w:tcPr>
+          <w:p>
+            <w:pPr>
+              <w:jc w:val="center"/>
+            </w:pPr>
             <w:r>
               <w:rPr>
                 <w:rFonts w:ascii="Arial" w:cs="Arial" w:eastAsia="Arial" w:hAnsi="Arial"/>
@@ -1073,90 +1119,31 @@
                 <w:sz w:val="20"/>
                 <w:szCs w:val="20"/>
               </w:rPr>
-              <w:t xml:space="preserve">📸 Resultado real del simulador de políticas para cada una de las cinco predicciones</w:t>
-            </w:r>
-          </w:p>
-        </w:tc>
-      </w:tr>
-      <w:tr>
-        <w:trPr>
-          <w:trHeight w:val="2400"/>
-        </w:trPr>
-        <w:tc>
-          <w:tcPr>
-            <w:tcW w:type="dxa" w:w="9638"/>
-            <w:tcBorders>
-              <w:top w:val="single" w:color="E0E0E0" w:sz="4"/>
-              <w:left w:val="single" w:color="E0E0E0" w:sz="4"/>
-              <w:bottom w:val="single" w:color="E0E0E0" w:sz="4"/>
-              <w:right w:val="single" w:color="E0E0E0" w:sz="4"/>
-            </w:tcBorders>
-            <w:shd w:fill="FAFAFA" w:val="clear"/>
-            <w:tcMar>
-              <w:top w:type="dxa" w:w="80"/>
-              <w:left w:type="dxa" w:w="160"/>
-              <w:bottom w:type="dxa" w:w="80"/>
-              <w:right w:type="dxa" w:w="160"/>
+              <w:t xml:space="preserve">Rol</w:t>
+            </w:r>
+          </w:p>
+        </w:tc>
+        <w:tc>
+          <w:tcPr>
+            <w:tcW w:type="dxa" w:w="2699"/>
+            <w:tcBorders>
+              <w:top w:val="single" w:color="E0E0E0" w:sz="4"/>
+              <w:left w:val="single" w:color="E0E0E0" w:sz="4"/>
+              <w:bottom w:val="single" w:color="E0E0E0" w:sz="4"/>
+              <w:right w:val="single" w:color="E0E0E0" w:sz="4"/>
+            </w:tcBorders>
+            <w:shd w:fill="3949AB" w:val="clear"/>
+            <w:tcMar>
+              <w:top w:type="dxa" w:w="100"/>
+              <w:left w:type="dxa" w:w="140"/>
+              <w:bottom w:type="dxa" w:w="100"/>
+              <w:right w:type="dxa" w:w="100"/>
             </w:tcMar>
           </w:tcPr>
           <w:p>
             <w:pPr>
               <w:jc w:val="center"/>
             </w:pPr>
-            <w:r>
-              <w:rPr>
-                <w:rFonts w:ascii="Arial" w:cs="Arial" w:eastAsia="Arial" w:hAnsi="Arial"/>
-                <w:i/>
-                <w:iCs/>
-                <w:color w:val="757575"/>
-                <w:sz w:val="20"/>
-                <w:szCs w:val="20"/>
-              </w:rPr>
-              <w:t xml:space="preserve">[Pega aquí la captura de pantalla]</w:t>
-            </w:r>
-          </w:p>
-        </w:tc>
-      </w:tr>
-    </w:tbl>
-    <w:p>
-      <w:pPr>
-        <w:spacing w:after="120"/>
-      </w:pPr>
-    </w:p>
-    <w:tbl>
-      <w:tblPr>
-        <w:tblW w:type="dxa" w:w="9638"/>
-        <w:tblBorders>
-          <w:top w:val="single" w:color="auto" w:sz="4"/>
-          <w:left w:val="single" w:color="auto" w:sz="4"/>
-          <w:bottom w:val="single" w:color="auto" w:sz="4"/>
-          <w:right w:val="single" w:color="auto" w:sz="4"/>
-          <w:insideH w:val="single" w:color="auto" w:sz="4"/>
-          <w:insideV w:val="single" w:color="auto" w:sz="4"/>
-        </w:tblBorders>
-      </w:tblPr>
-      <w:tblGrid>
-        <w:gridCol w:w="9638"/>
-      </w:tblGrid>
-      <w:tr>
-        <w:tc>
-          <w:tcPr>
-            <w:tcW w:type="dxa" w:w="9638"/>
-            <w:tcBorders>
-              <w:top w:val="none" w:color="FFFFFF" w:sz="0"/>
-              <w:left w:val="none" w:color="FFFFFF" w:sz="0"/>
-              <w:bottom w:val="none" w:color="FFFFFF" w:sz="0"/>
-              <w:right w:val="none" w:color="FFFFFF" w:sz="0"/>
-            </w:tcBorders>
-            <w:shd w:fill="3949AB" w:val="clear"/>
-            <w:tcMar>
-              <w:top w:type="dxa" w:w="80"/>
-              <w:left w:type="dxa" w:w="160"/>
-              <w:bottom w:type="dxa" w:w="80"/>
-              <w:right w:type="dxa" w:w="160"/>
-            </w:tcMar>
-          </w:tcPr>
-          <w:p>
             <w:r>
               <w:rPr>
                 <w:rFonts w:ascii="Arial" w:cs="Arial" w:eastAsia="Arial" w:hAnsi="Arial"/>
@@ -1166,264 +1153,31 @@
                 <w:sz w:val="20"/>
                 <w:szCs w:val="20"/>
               </w:rPr>
-              <w:t xml:space="preserve">📸 Las cinco políticas corregidas al mínimo privilegio real</w:t>
-            </w:r>
-          </w:p>
-        </w:tc>
-      </w:tr>
-      <w:tr>
-        <w:trPr>
-          <w:trHeight w:val="2400"/>
-        </w:trPr>
-        <w:tc>
-          <w:tcPr>
-            <w:tcW w:type="dxa" w:w="9638"/>
-            <w:tcBorders>
-              <w:top w:val="single" w:color="E0E0E0" w:sz="4"/>
-              <w:left w:val="single" w:color="E0E0E0" w:sz="4"/>
-              <w:bottom w:val="single" w:color="E0E0E0" w:sz="4"/>
-              <w:right w:val="single" w:color="E0E0E0" w:sz="4"/>
-            </w:tcBorders>
-            <w:shd w:fill="FAFAFA" w:val="clear"/>
-            <w:tcMar>
-              <w:top w:type="dxa" w:w="80"/>
-              <w:left w:type="dxa" w:w="160"/>
-              <w:bottom w:type="dxa" w:w="80"/>
-              <w:right w:type="dxa" w:w="160"/>
+              <w:t xml:space="preserve">Qué necesita poder hacer</w:t>
+            </w:r>
+          </w:p>
+        </w:tc>
+        <w:tc>
+          <w:tcPr>
+            <w:tcW w:type="dxa" w:w="2699"/>
+            <w:tcBorders>
+              <w:top w:val="single" w:color="E0E0E0" w:sz="4"/>
+              <w:left w:val="single" w:color="E0E0E0" w:sz="4"/>
+              <w:bottom w:val="single" w:color="E0E0E0" w:sz="4"/>
+              <w:right w:val="single" w:color="E0E0E0" w:sz="4"/>
+            </w:tcBorders>
+            <w:shd w:fill="3949AB" w:val="clear"/>
+            <w:tcMar>
+              <w:top w:type="dxa" w:w="100"/>
+              <w:left w:type="dxa" w:w="140"/>
+              <w:bottom w:type="dxa" w:w="100"/>
+              <w:right w:type="dxa" w:w="100"/>
             </w:tcMar>
           </w:tcPr>
           <w:p>
             <w:pPr>
               <w:jc w:val="center"/>
             </w:pPr>
-            <w:r>
-              <w:rPr>
-                <w:rFonts w:ascii="Arial" w:cs="Arial" w:eastAsia="Arial" w:hAnsi="Arial"/>
-                <w:i/>
-                <w:iCs/>
-                <w:color w:val="757575"/>
-                <w:sz w:val="20"/>
-                <w:szCs w:val="20"/>
-              </w:rPr>
-              <w:t xml:space="preserve">[Pega aquí la captura de pantalla]</w:t>
-            </w:r>
-          </w:p>
-        </w:tc>
-      </w:tr>
-    </w:tbl>
-    <w:p>
-      <w:pPr>
-        <w:spacing w:after="200"/>
-      </w:pPr>
-    </w:p>
-    <w:p>
-      <w:r>
-        <w:br w:type="page"/>
-      </w:r>
-    </w:p>
-    <w:p>
-      <w:pPr>
-        <w:pBdr>
-          <w:bottom w:val="single" w:color="FFA000" w:sz="4" w:space="1"/>
-        </w:pBdr>
-        <w:spacing w:after="120" w:before="240"/>
-      </w:pPr>
-      <w:r>
-        <w:rPr>
-          <w:rFonts w:ascii="Arial" w:cs="Arial" w:eastAsia="Arial" w:hAnsi="Arial"/>
-          <w:b/>
-          <w:bCs/>
-          <w:color w:val="3949AB"/>
-          <w:sz w:val="24"/>
-          <w:szCs w:val="24"/>
-        </w:rPr>
-        <w:t xml:space="preserve">Confirma que la base de datos sigue sin credenciales en el código</w:t>
-      </w:r>
-    </w:p>
-    <w:p>
-      <w:pPr>
-        <w:spacing w:after="100"/>
-      </w:pPr>
-      <w:r>
-        <w:rPr>
-          <w:rFonts w:ascii="Arial" w:cs="Arial" w:eastAsia="Arial" w:hAnsi="Arial"/>
-          <w:color w:val="212121"/>
-          <w:sz w:val="22"/>
-          <w:szCs w:val="22"/>
-        </w:rPr>
-        <w:t xml:space="preserve">Verificación, a partir de la ruta /estado-bd y del código de app.py, de que la credencial de base de datos llega por variable de entorno y no aparece escrita en el código ni en ningún commit del repositorio.</w:t>
-      </w:r>
-    </w:p>
-    <w:tbl>
-      <w:tblPr>
-        <w:tblW w:type="dxa" w:w="9638"/>
-        <w:tblBorders>
-          <w:top w:val="single" w:color="auto" w:sz="4"/>
-          <w:left w:val="single" w:color="auto" w:sz="4"/>
-          <w:bottom w:val="single" w:color="auto" w:sz="4"/>
-          <w:right w:val="single" w:color="auto" w:sz="4"/>
-          <w:insideH w:val="single" w:color="auto" w:sz="4"/>
-          <w:insideV w:val="single" w:color="auto" w:sz="4"/>
-        </w:tblBorders>
-      </w:tblPr>
-      <w:tblGrid>
-        <w:gridCol w:w="9638"/>
-      </w:tblGrid>
-      <w:tr>
-        <w:trPr>
-          <w:trHeight w:val="480"/>
-        </w:trPr>
-        <w:tc>
-          <w:tcPr>
-            <w:tcW w:type="dxa" w:w="9638"/>
-            <w:tcBorders>
-              <w:top w:val="single" w:color="E0E0E0" w:sz="4"/>
-              <w:left w:val="single" w:color="E0E0E0" w:sz="4"/>
-              <w:bottom w:val="single" w:color="E0E0E0" w:sz="4"/>
-              <w:right w:val="single" w:color="E0E0E0" w:sz="4"/>
-            </w:tcBorders>
-            <w:shd w:fill="FAFAFA" w:val="clear"/>
-            <w:tcMar>
-              <w:top w:type="dxa" w:w="60"/>
-              <w:left w:type="dxa" w:w="160"/>
-              <w:bottom w:type="dxa" w:w="60"/>
-              <w:right w:type="dxa" w:w="160"/>
-            </w:tcMar>
-          </w:tcPr>
-          <w:p>
-            <w:r>
-              <w:rPr>
-                <w:sz w:val="22"/>
-                <w:szCs w:val="22"/>
-              </w:rPr>
-              <w:t xml:space="preserve"/>
-            </w:r>
-          </w:p>
-        </w:tc>
-      </w:tr>
-      <w:tr>
-        <w:trPr>
-          <w:trHeight w:val="480"/>
-        </w:trPr>
-        <w:tc>
-          <w:tcPr>
-            <w:tcW w:type="dxa" w:w="9638"/>
-            <w:tcBorders>
-              <w:top w:val="single" w:color="E0E0E0" w:sz="4"/>
-              <w:left w:val="single" w:color="E0E0E0" w:sz="4"/>
-              <w:bottom w:val="single" w:color="E0E0E0" w:sz="4"/>
-              <w:right w:val="single" w:color="E0E0E0" w:sz="4"/>
-            </w:tcBorders>
-            <w:shd w:fill="FAFAFA" w:val="clear"/>
-            <w:tcMar>
-              <w:top w:type="dxa" w:w="60"/>
-              <w:left w:type="dxa" w:w="160"/>
-              <w:bottom w:type="dxa" w:w="60"/>
-              <w:right w:type="dxa" w:w="160"/>
-            </w:tcMar>
-          </w:tcPr>
-          <w:p>
-            <w:r>
-              <w:rPr>
-                <w:sz w:val="22"/>
-                <w:szCs w:val="22"/>
-              </w:rPr>
-              <w:t xml:space="preserve"/>
-            </w:r>
-          </w:p>
-        </w:tc>
-      </w:tr>
-      <w:tr>
-        <w:trPr>
-          <w:trHeight w:val="480"/>
-        </w:trPr>
-        <w:tc>
-          <w:tcPr>
-            <w:tcW w:type="dxa" w:w="9638"/>
-            <w:tcBorders>
-              <w:top w:val="single" w:color="E0E0E0" w:sz="4"/>
-              <w:left w:val="single" w:color="E0E0E0" w:sz="4"/>
-              <w:bottom w:val="single" w:color="E0E0E0" w:sz="4"/>
-              <w:right w:val="single" w:color="E0E0E0" w:sz="4"/>
-            </w:tcBorders>
-            <w:shd w:fill="FAFAFA" w:val="clear"/>
-            <w:tcMar>
-              <w:top w:type="dxa" w:w="60"/>
-              <w:left w:type="dxa" w:w="160"/>
-              <w:bottom w:type="dxa" w:w="60"/>
-              <w:right w:type="dxa" w:w="160"/>
-            </w:tcMar>
-          </w:tcPr>
-          <w:p>
-            <w:r>
-              <w:rPr>
-                <w:sz w:val="22"/>
-                <w:szCs w:val="22"/>
-              </w:rPr>
-              <w:t xml:space="preserve"/>
-            </w:r>
-          </w:p>
-        </w:tc>
-      </w:tr>
-    </w:tbl>
-    <w:p>
-      <w:pPr>
-        <w:spacing w:after="160"/>
-      </w:pPr>
-    </w:p>
-    <w:p>
-      <w:pPr>
-        <w:pBdr>
-          <w:bottom w:val="single" w:color="FFA000" w:sz="4" w:space="1"/>
-        </w:pBdr>
-        <w:spacing w:after="120" w:before="240"/>
-      </w:pPr>
-      <w:r>
-        <w:rPr>
-          <w:rFonts w:ascii="Arial" w:cs="Arial" w:eastAsia="Arial" w:hAnsi="Arial"/>
-          <w:b/>
-          <w:bCs/>
-          <w:color w:val="3949AB"/>
-          <w:sz w:val="24"/>
-          <w:szCs w:val="24"/>
-        </w:rPr>
-        <w:t xml:space="preserve">Localiza en el registro de auditoría quién hizo qué</w:t>
-      </w:r>
-    </w:p>
-    <w:tbl>
-      <w:tblPr>
-        <w:tblW w:type="dxa" w:w="9638"/>
-        <w:tblBorders>
-          <w:top w:val="single" w:color="auto" w:sz="4"/>
-          <w:left w:val="single" w:color="auto" w:sz="4"/>
-          <w:bottom w:val="single" w:color="auto" w:sz="4"/>
-          <w:right w:val="single" w:color="auto" w:sz="4"/>
-          <w:insideH w:val="single" w:color="auto" w:sz="4"/>
-          <w:insideV w:val="single" w:color="auto" w:sz="4"/>
-        </w:tblBorders>
-      </w:tblPr>
-      <w:tblGrid>
-        <w:gridCol w:w="9638"/>
-      </w:tblGrid>
-      <w:tr>
-        <w:tc>
-          <w:tcPr>
-            <w:tcW w:type="dxa" w:w="9638"/>
-            <w:tcBorders>
-              <w:top w:val="none" w:color="FFFFFF" w:sz="0"/>
-              <w:left w:val="none" w:color="FFFFFF" w:sz="0"/>
-              <w:bottom w:val="none" w:color="FFFFFF" w:sz="0"/>
-              <w:right w:val="none" w:color="FFFFFF" w:sz="0"/>
-            </w:tcBorders>
-            <w:shd w:fill="3949AB" w:val="clear"/>
-            <w:tcMar>
-              <w:top w:type="dxa" w:w="80"/>
-              <w:left w:type="dxa" w:w="160"/>
-              <w:bottom w:type="dxa" w:w="80"/>
-              <w:right w:type="dxa" w:w="160"/>
-            </w:tcMar>
-          </w:tcPr>
-          <w:p>
             <w:r>
               <w:rPr>
                 <w:rFonts w:ascii="Arial" w:cs="Arial" w:eastAsia="Arial" w:hAnsi="Arial"/>
@@ -1433,46 +1187,380 @@
                 <w:sz w:val="20"/>
                 <w:szCs w:val="20"/>
               </w:rPr>
-              <w:t xml:space="preserve">📸 Evento de CloudTrail de la corrección de la incidencia de la Actividad 5.1, con su marca de tiempo</w:t>
+              <w:t xml:space="preserve">Qué NO debería poder hacer</w:t>
+            </w:r>
+          </w:p>
+        </w:tc>
+        <w:tc>
+          <w:tcPr>
+            <w:tcW w:type="dxa" w:w="2795"/>
+            <w:tcBorders>
+              <w:top w:val="single" w:color="E0E0E0" w:sz="4"/>
+              <w:left w:val="single" w:color="E0E0E0" w:sz="4"/>
+              <w:bottom w:val="single" w:color="E0E0E0" w:sz="4"/>
+              <w:right w:val="single" w:color="E0E0E0" w:sz="4"/>
+            </w:tcBorders>
+            <w:shd w:fill="3949AB" w:val="clear"/>
+            <w:tcMar>
+              <w:top w:type="dxa" w:w="100"/>
+              <w:left w:type="dxa" w:w="140"/>
+              <w:bottom w:type="dxa" w:w="100"/>
+              <w:right w:type="dxa" w:w="100"/>
+            </w:tcMar>
+          </w:tcPr>
+          <w:p>
+            <w:pPr>
+              <w:jc w:val="center"/>
+            </w:pPr>
+            <w:r>
+              <w:rPr>
+                <w:rFonts w:ascii="Arial" w:cs="Arial" w:eastAsia="Arial" w:hAnsi="Arial"/>
+                <w:b/>
+                <w:bCs/>
+                <w:color w:val="FFFFFF"/>
+                <w:sz w:val="20"/>
+                <w:szCs w:val="20"/>
+              </w:rPr>
+              <w:t xml:space="preserve">Por qué</w:t>
             </w:r>
           </w:p>
         </w:tc>
       </w:tr>
       <w:tr>
         <w:trPr>
-          <w:trHeight w:val="2400"/>
+          <w:trHeight w:val="800"/>
         </w:trPr>
         <w:tc>
           <w:tcPr>
-            <w:tcW w:type="dxa" w:w="9638"/>
-            <w:tcBorders>
-              <w:top w:val="single" w:color="E0E0E0" w:sz="4"/>
-              <w:left w:val="single" w:color="E0E0E0" w:sz="4"/>
-              <w:bottom w:val="single" w:color="E0E0E0" w:sz="4"/>
-              <w:right w:val="single" w:color="E0E0E0" w:sz="4"/>
-            </w:tcBorders>
-            <w:shd w:fill="FAFAFA" w:val="clear"/>
+            <w:tcW w:type="dxa" w:w="1446"/>
+            <w:tcBorders>
+              <w:top w:val="single" w:color="E0E0E0" w:sz="4"/>
+              <w:left w:val="single" w:color="E0E0E0" w:sz="4"/>
+              <w:bottom w:val="single" w:color="E0E0E0" w:sz="4"/>
+              <w:right w:val="single" w:color="E0E0E0" w:sz="4"/>
+            </w:tcBorders>
+            <w:shd w:fill="FFFFFF" w:val="clear"/>
             <w:tcMar>
               <w:top w:type="dxa" w:w="80"/>
-              <w:left w:type="dxa" w:w="160"/>
+              <w:left w:type="dxa" w:w="140"/>
               <w:bottom w:type="dxa" w:w="80"/>
-              <w:right w:type="dxa" w:w="160"/>
-            </w:tcMar>
-          </w:tcPr>
-          <w:p>
-            <w:pPr>
-              <w:jc w:val="center"/>
-            </w:pPr>
-            <w:r>
-              <w:rPr>
-                <w:rFonts w:ascii="Arial" w:cs="Arial" w:eastAsia="Arial" w:hAnsi="Arial"/>
-                <w:i/>
-                <w:iCs/>
-                <w:color w:val="757575"/>
-                <w:sz w:val="20"/>
-                <w:szCs w:val="20"/>
-              </w:rPr>
-              <w:t xml:space="preserve">[Pega aquí la captura de pantalla]</w:t>
+              <w:right w:type="dxa" w:w="100"/>
+            </w:tcMar>
+          </w:tcPr>
+          <w:p>
+            <w:r>
+              <w:rPr>
+                <w:sz w:val="22"/>
+                <w:szCs w:val="22"/>
+              </w:rPr>
+              <w:t xml:space="preserve"/>
+            </w:r>
+          </w:p>
+        </w:tc>
+        <w:tc>
+          <w:tcPr>
+            <w:tcW w:type="dxa" w:w="2699"/>
+            <w:tcBorders>
+              <w:top w:val="single" w:color="E0E0E0" w:sz="4"/>
+              <w:left w:val="single" w:color="E0E0E0" w:sz="4"/>
+              <w:bottom w:val="single" w:color="E0E0E0" w:sz="4"/>
+              <w:right w:val="single" w:color="E0E0E0" w:sz="4"/>
+            </w:tcBorders>
+            <w:shd w:fill="FFFFFF" w:val="clear"/>
+            <w:tcMar>
+              <w:top w:type="dxa" w:w="80"/>
+              <w:left w:type="dxa" w:w="140"/>
+              <w:bottom w:type="dxa" w:w="80"/>
+              <w:right w:type="dxa" w:w="100"/>
+            </w:tcMar>
+          </w:tcPr>
+          <w:p>
+            <w:r>
+              <w:rPr>
+                <w:sz w:val="22"/>
+                <w:szCs w:val="22"/>
+              </w:rPr>
+              <w:t xml:space="preserve"/>
+            </w:r>
+          </w:p>
+        </w:tc>
+        <w:tc>
+          <w:tcPr>
+            <w:tcW w:type="dxa" w:w="2699"/>
+            <w:tcBorders>
+              <w:top w:val="single" w:color="E0E0E0" w:sz="4"/>
+              <w:left w:val="single" w:color="E0E0E0" w:sz="4"/>
+              <w:bottom w:val="single" w:color="E0E0E0" w:sz="4"/>
+              <w:right w:val="single" w:color="E0E0E0" w:sz="4"/>
+            </w:tcBorders>
+            <w:shd w:fill="FFFFFF" w:val="clear"/>
+            <w:tcMar>
+              <w:top w:type="dxa" w:w="80"/>
+              <w:left w:type="dxa" w:w="140"/>
+              <w:bottom w:type="dxa" w:w="80"/>
+              <w:right w:type="dxa" w:w="100"/>
+            </w:tcMar>
+          </w:tcPr>
+          <w:p>
+            <w:r>
+              <w:rPr>
+                <w:sz w:val="22"/>
+                <w:szCs w:val="22"/>
+              </w:rPr>
+              <w:t xml:space="preserve"/>
+            </w:r>
+          </w:p>
+        </w:tc>
+        <w:tc>
+          <w:tcPr>
+            <w:tcW w:type="dxa" w:w="2795"/>
+            <w:tcBorders>
+              <w:top w:val="single" w:color="E0E0E0" w:sz="4"/>
+              <w:left w:val="single" w:color="E0E0E0" w:sz="4"/>
+              <w:bottom w:val="single" w:color="E0E0E0" w:sz="4"/>
+              <w:right w:val="single" w:color="E0E0E0" w:sz="4"/>
+            </w:tcBorders>
+            <w:shd w:fill="FFFFFF" w:val="clear"/>
+            <w:tcMar>
+              <w:top w:type="dxa" w:w="80"/>
+              <w:left w:type="dxa" w:w="140"/>
+              <w:bottom w:type="dxa" w:w="80"/>
+              <w:right w:type="dxa" w:w="100"/>
+            </w:tcMar>
+          </w:tcPr>
+          <w:p>
+            <w:r>
+              <w:rPr>
+                <w:sz w:val="22"/>
+                <w:szCs w:val="22"/>
+              </w:rPr>
+              <w:t xml:space="preserve"/>
+            </w:r>
+          </w:p>
+        </w:tc>
+      </w:tr>
+      <w:tr>
+        <w:trPr>
+          <w:trHeight w:val="800"/>
+        </w:trPr>
+        <w:tc>
+          <w:tcPr>
+            <w:tcW w:type="dxa" w:w="1446"/>
+            <w:tcBorders>
+              <w:top w:val="single" w:color="E0E0E0" w:sz="4"/>
+              <w:left w:val="single" w:color="E0E0E0" w:sz="4"/>
+              <w:bottom w:val="single" w:color="E0E0E0" w:sz="4"/>
+              <w:right w:val="single" w:color="E0E0E0" w:sz="4"/>
+            </w:tcBorders>
+            <w:shd w:fill="F5F5F5" w:val="clear"/>
+            <w:tcMar>
+              <w:top w:type="dxa" w:w="80"/>
+              <w:left w:type="dxa" w:w="140"/>
+              <w:bottom w:type="dxa" w:w="80"/>
+              <w:right w:type="dxa" w:w="100"/>
+            </w:tcMar>
+          </w:tcPr>
+          <w:p>
+            <w:r>
+              <w:rPr>
+                <w:sz w:val="22"/>
+                <w:szCs w:val="22"/>
+              </w:rPr>
+              <w:t xml:space="preserve"/>
+            </w:r>
+          </w:p>
+        </w:tc>
+        <w:tc>
+          <w:tcPr>
+            <w:tcW w:type="dxa" w:w="2699"/>
+            <w:tcBorders>
+              <w:top w:val="single" w:color="E0E0E0" w:sz="4"/>
+              <w:left w:val="single" w:color="E0E0E0" w:sz="4"/>
+              <w:bottom w:val="single" w:color="E0E0E0" w:sz="4"/>
+              <w:right w:val="single" w:color="E0E0E0" w:sz="4"/>
+            </w:tcBorders>
+            <w:shd w:fill="F5F5F5" w:val="clear"/>
+            <w:tcMar>
+              <w:top w:type="dxa" w:w="80"/>
+              <w:left w:type="dxa" w:w="140"/>
+              <w:bottom w:type="dxa" w:w="80"/>
+              <w:right w:type="dxa" w:w="100"/>
+            </w:tcMar>
+          </w:tcPr>
+          <w:p>
+            <w:r>
+              <w:rPr>
+                <w:sz w:val="22"/>
+                <w:szCs w:val="22"/>
+              </w:rPr>
+              <w:t xml:space="preserve"/>
+            </w:r>
+          </w:p>
+        </w:tc>
+        <w:tc>
+          <w:tcPr>
+            <w:tcW w:type="dxa" w:w="2699"/>
+            <w:tcBorders>
+              <w:top w:val="single" w:color="E0E0E0" w:sz="4"/>
+              <w:left w:val="single" w:color="E0E0E0" w:sz="4"/>
+              <w:bottom w:val="single" w:color="E0E0E0" w:sz="4"/>
+              <w:right w:val="single" w:color="E0E0E0" w:sz="4"/>
+            </w:tcBorders>
+            <w:shd w:fill="F5F5F5" w:val="clear"/>
+            <w:tcMar>
+              <w:top w:type="dxa" w:w="80"/>
+              <w:left w:type="dxa" w:w="140"/>
+              <w:bottom w:type="dxa" w:w="80"/>
+              <w:right w:type="dxa" w:w="100"/>
+            </w:tcMar>
+          </w:tcPr>
+          <w:p>
+            <w:r>
+              <w:rPr>
+                <w:sz w:val="22"/>
+                <w:szCs w:val="22"/>
+              </w:rPr>
+              <w:t xml:space="preserve"/>
+            </w:r>
+          </w:p>
+        </w:tc>
+        <w:tc>
+          <w:tcPr>
+            <w:tcW w:type="dxa" w:w="2795"/>
+            <w:tcBorders>
+              <w:top w:val="single" w:color="E0E0E0" w:sz="4"/>
+              <w:left w:val="single" w:color="E0E0E0" w:sz="4"/>
+              <w:bottom w:val="single" w:color="E0E0E0" w:sz="4"/>
+              <w:right w:val="single" w:color="E0E0E0" w:sz="4"/>
+            </w:tcBorders>
+            <w:shd w:fill="F5F5F5" w:val="clear"/>
+            <w:tcMar>
+              <w:top w:type="dxa" w:w="80"/>
+              <w:left w:type="dxa" w:w="140"/>
+              <w:bottom w:type="dxa" w:w="80"/>
+              <w:right w:type="dxa" w:w="100"/>
+            </w:tcMar>
+          </w:tcPr>
+          <w:p>
+            <w:r>
+              <w:rPr>
+                <w:sz w:val="22"/>
+                <w:szCs w:val="22"/>
+              </w:rPr>
+              <w:t xml:space="preserve"/>
+            </w:r>
+          </w:p>
+        </w:tc>
+      </w:tr>
+      <w:tr>
+        <w:trPr>
+          <w:trHeight w:val="800"/>
+        </w:trPr>
+        <w:tc>
+          <w:tcPr>
+            <w:tcW w:type="dxa" w:w="1446"/>
+            <w:tcBorders>
+              <w:top w:val="single" w:color="E0E0E0" w:sz="4"/>
+              <w:left w:val="single" w:color="E0E0E0" w:sz="4"/>
+              <w:bottom w:val="single" w:color="E0E0E0" w:sz="4"/>
+              <w:right w:val="single" w:color="E0E0E0" w:sz="4"/>
+            </w:tcBorders>
+            <w:shd w:fill="FFFFFF" w:val="clear"/>
+            <w:tcMar>
+              <w:top w:type="dxa" w:w="80"/>
+              <w:left w:type="dxa" w:w="140"/>
+              <w:bottom w:type="dxa" w:w="80"/>
+              <w:right w:type="dxa" w:w="100"/>
+            </w:tcMar>
+          </w:tcPr>
+          <w:p>
+            <w:r>
+              <w:rPr>
+                <w:sz w:val="22"/>
+                <w:szCs w:val="22"/>
+              </w:rPr>
+              <w:t xml:space="preserve"/>
+            </w:r>
+          </w:p>
+        </w:tc>
+        <w:tc>
+          <w:tcPr>
+            <w:tcW w:type="dxa" w:w="2699"/>
+            <w:tcBorders>
+              <w:top w:val="single" w:color="E0E0E0" w:sz="4"/>
+              <w:left w:val="single" w:color="E0E0E0" w:sz="4"/>
+              <w:bottom w:val="single" w:color="E0E0E0" w:sz="4"/>
+              <w:right w:val="single" w:color="E0E0E0" w:sz="4"/>
+            </w:tcBorders>
+            <w:shd w:fill="FFFFFF" w:val="clear"/>
+            <w:tcMar>
+              <w:top w:type="dxa" w:w="80"/>
+              <w:left w:type="dxa" w:w="140"/>
+              <w:bottom w:type="dxa" w:w="80"/>
+              <w:right w:type="dxa" w:w="100"/>
+            </w:tcMar>
+          </w:tcPr>
+          <w:p>
+            <w:r>
+              <w:rPr>
+                <w:sz w:val="22"/>
+                <w:szCs w:val="22"/>
+              </w:rPr>
+              <w:t xml:space="preserve"/>
+            </w:r>
+          </w:p>
+        </w:tc>
+        <w:tc>
+          <w:tcPr>
+            <w:tcW w:type="dxa" w:w="2699"/>
+            <w:tcBorders>
+              <w:top w:val="single" w:color="E0E0E0" w:sz="4"/>
+              <w:left w:val="single" w:color="E0E0E0" w:sz="4"/>
+              <w:bottom w:val="single" w:color="E0E0E0" w:sz="4"/>
+              <w:right w:val="single" w:color="E0E0E0" w:sz="4"/>
+            </w:tcBorders>
+            <w:shd w:fill="FFFFFF" w:val="clear"/>
+            <w:tcMar>
+              <w:top w:type="dxa" w:w="80"/>
+              <w:left w:type="dxa" w:w="140"/>
+              <w:bottom w:type="dxa" w:w="80"/>
+              <w:right w:type="dxa" w:w="100"/>
+            </w:tcMar>
+          </w:tcPr>
+          <w:p>
+            <w:r>
+              <w:rPr>
+                <w:sz w:val="22"/>
+                <w:szCs w:val="22"/>
+              </w:rPr>
+              <w:t xml:space="preserve"/>
+            </w:r>
+          </w:p>
+        </w:tc>
+        <w:tc>
+          <w:tcPr>
+            <w:tcW w:type="dxa" w:w="2795"/>
+            <w:tcBorders>
+              <w:top w:val="single" w:color="E0E0E0" w:sz="4"/>
+              <w:left w:val="single" w:color="E0E0E0" w:sz="4"/>
+              <w:bottom w:val="single" w:color="E0E0E0" w:sz="4"/>
+              <w:right w:val="single" w:color="E0E0E0" w:sz="4"/>
+            </w:tcBorders>
+            <w:shd w:fill="FFFFFF" w:val="clear"/>
+            <w:tcMar>
+              <w:top w:type="dxa" w:w="80"/>
+              <w:left w:type="dxa" w:w="140"/>
+              <w:bottom w:type="dxa" w:w="80"/>
+              <w:right w:type="dxa" w:w="100"/>
+            </w:tcMar>
+          </w:tcPr>
+          <w:p>
+            <w:r>
+              <w:rPr>
+                <w:sz w:val="22"/>
+                <w:szCs w:val="22"/>
+              </w:rPr>
+              <w:t xml:space="preserve"/>
             </w:r>
           </w:p>
         </w:tc>

</xml_diff>